<commit_message>
docs(group-08): complete dossier, video links, battery demo 0.27
</commit_message>
<xml_diff>
--- a/Group_08_Manikya_Shourya_Keswani_Vora/docs/MDRIIA_Group_08_Technical_Dossier.docx
+++ b/Group_08_Manikya_Shourya_Keswani_Vora/docs/MDRIIA_Group_08_Technical_Dossier.docx
@@ -7047,7 +7047,7 @@
                     <w:sz w:val="14"/>
                     <w:szCs w:val="14"/>
                   </w:rPr>
-                  <w:t xml:space="preserve">power model in the loop; ABORT/RTB if predicted SoC at the pad &lt; 25 % (--battery-soc 0.3 demo)</w:t>
+                  <w:t xml:space="preserve">power model in the loop; ABORT/RTB if predicted SoC at the pad &lt; 25 % (--battery-soc 0.27 demo)</w:t>
                 </w:r>
               </w:sdtContent>
             </w:sdt>
@@ -10520,7 +10520,7 @@
                     <w:sz w:val="15"/>
                     <w:szCs w:val="15"/>
                   </w:rPr>
-                  <w:t xml:space="preserve">type here</w:t>
+                  <w:t xml:space="preserve">https://lnkd.in/p/dwu8AHcT</w:t>
                 </w:r>
               </w:sdtContent>
             </w:sdt>
@@ -10579,7 +10579,7 @@
                     <w:sz w:val="15"/>
                     <w:szCs w:val="15"/>
                   </w:rPr>
-                  <w:t xml:space="preserve">type here</w:t>
+                  <w:t xml:space="preserve">3:45</w:t>
                 </w:r>
               </w:sdtContent>
             </w:sdt>
@@ -10642,7 +10642,7 @@
                     <w:sz w:val="15"/>
                     <w:szCs w:val="15"/>
                   </w:rPr>
-                  <w:t xml:space="preserve">Select ▾</w:t>
+                  <w:t xml:space="preserve">Yes</w:t>
                 </w:r>
               </w:sdtContent>
             </w:sdt>
@@ -10705,7 +10705,7 @@
                     <w:sz w:val="15"/>
                     <w:szCs w:val="15"/>
                   </w:rPr>
-                  <w:t xml:space="preserve">Select ▾</w:t>
+                  <w:t xml:space="preserve">Yes</w:t>
                 </w:r>
               </w:sdtContent>
             </w:sdt>
@@ -10766,7 +10766,7 @@
                     <w:sz w:val="15"/>
                     <w:szCs w:val="15"/>
                   </w:rPr>
-                  <w:t xml:space="preserve">Select ▾</w:t>
+                  <w:t xml:space="preserve">Yes</w:t>
                 </w:r>
               </w:sdtContent>
             </w:sdt>
@@ -12011,7 +12011,7 @@
                     <w:sz w:val="14"/>
                     <w:szCs w:val="14"/>
                   </w:rPr>
-                  <w:t xml:space="preserve">Select ▾</w:t>
+                  <w:t xml:space="preserve">2</w:t>
                 </w:r>
               </w:sdtContent>
             </w:sdt>
@@ -12048,7 +12048,7 @@
                     <w:sz w:val="14"/>
                     <w:szCs w:val="14"/>
                   </w:rPr>
-                  <w:t xml:space="preserve">Select ▾</w:t>
+                  <w:t xml:space="preserve">2</w:t>
                 </w:r>
               </w:sdtContent>
             </w:sdt>
@@ -12085,7 +12085,7 @@
                     <w:sz w:val="14"/>
                     <w:szCs w:val="14"/>
                   </w:rPr>
-                  <w:t xml:space="preserve">Select ▾</w:t>
+                  <w:t xml:space="preserve">2</w:t>
                 </w:r>
               </w:sdtContent>
             </w:sdt>
@@ -12122,7 +12122,7 @@
                     <w:sz w:val="14"/>
                     <w:szCs w:val="14"/>
                   </w:rPr>
-                  <w:t xml:space="preserve">Select ▾</w:t>
+                  <w:t xml:space="preserve">2</w:t>
                 </w:r>
               </w:sdtContent>
             </w:sdt>
@@ -12159,7 +12159,7 @@
                     <w:sz w:val="14"/>
                     <w:szCs w:val="14"/>
                   </w:rPr>
-                  <w:t xml:space="preserve">Select ▾</w:t>
+                  <w:t xml:space="preserve">2</w:t>
                 </w:r>
               </w:sdtContent>
             </w:sdt>
@@ -12191,7 +12191,7 @@
                     <w:sz w:val="14"/>
                     <w:szCs w:val="14"/>
                   </w:rPr>
-                  <w:t xml:space="preserve">type here</w:t>
+                  <w:t xml:space="preserve">0:20–1:40 · live MuJoCo run: the UGV replans around high-cost cells of its LiDAR traversability map on rough terrain</w:t>
                 </w:r>
               </w:sdtContent>
             </w:sdt>
@@ -12223,7 +12223,7 @@
                     <w:sz w:val="14"/>
                     <w:szCs w:val="14"/>
                   </w:rPr>
-                  <w:t xml:space="preserve">type here</w:t>
+                  <w:t xml:space="preserve">How did you choose the slope vs roughness weights in your traversability cost, and how much does skid-steer wheel slip on loose rubble (MuJoCo friction) move the UGV off the planned path?</w:t>
                 </w:r>
               </w:sdtContent>
             </w:sdt>
@@ -12285,7 +12285,7 @@
                     <w:sz w:val="14"/>
                     <w:szCs w:val="14"/>
                   </w:rPr>
-                  <w:t xml:space="preserve">Select ▾</w:t>
+                  <w:t xml:space="preserve">2</w:t>
                 </w:r>
               </w:sdtContent>
             </w:sdt>
@@ -12321,7 +12321,7 @@
                     <w:sz w:val="14"/>
                     <w:szCs w:val="14"/>
                   </w:rPr>
-                  <w:t xml:space="preserve">Select ▾</w:t>
+                  <w:t xml:space="preserve">2</w:t>
                 </w:r>
               </w:sdtContent>
             </w:sdt>
@@ -12357,7 +12357,7 @@
                     <w:sz w:val="14"/>
                     <w:szCs w:val="14"/>
                   </w:rPr>
-                  <w:t xml:space="preserve">Select ▾</w:t>
+                  <w:t xml:space="preserve">2</w:t>
                 </w:r>
               </w:sdtContent>
             </w:sdt>
@@ -12393,7 +12393,7 @@
                     <w:sz w:val="14"/>
                     <w:szCs w:val="14"/>
                   </w:rPr>
-                  <w:t xml:space="preserve">Select ▾</w:t>
+                  <w:t xml:space="preserve">2</w:t>
                 </w:r>
               </w:sdtContent>
             </w:sdt>
@@ -12429,7 +12429,7 @@
                     <w:sz w:val="14"/>
                     <w:szCs w:val="14"/>
                   </w:rPr>
-                  <w:t xml:space="preserve">Select ▾</w:t>
+                  <w:t xml:space="preserve">2</w:t>
                 </w:r>
               </w:sdtContent>
             </w:sdt>
@@ -12460,7 +12460,7 @@
                     <w:sz w:val="14"/>
                     <w:szCs w:val="14"/>
                   </w:rPr>
-                  <w:t xml:space="preserve">type here</w:t>
+                  <w:t xml:space="preserve">0:20–1:40 · live MuJoCo run: the companion robot detects the fall from the MediaPipe pose and raises the alert</w:t>
                 </w:r>
               </w:sdtContent>
             </w:sdt>
@@ -12491,7 +12491,7 @@
                     <w:sz w:val="14"/>
                     <w:szCs w:val="14"/>
                   </w:rPr>
-                  <w:t xml:space="preserve">type here</w:t>
+                  <w:t xml:space="preserve">What is your false-alarm rate when a person simply lies down to rest, and how do false alarms change your dispatch-latency result and the cost model?</w:t>
                 </w:r>
               </w:sdtContent>
             </w:sdt>
@@ -12797,7 +12797,7 @@
                     <w:sz w:val="14"/>
                     <w:szCs w:val="14"/>
                   </w:rPr>
-                  <w:t xml:space="preserve">type here</w:t>
+                  <w:t xml:space="preserve">60</w:t>
                 </w:r>
               </w:sdtContent>
             </w:sdt>
@@ -12836,7 +12836,7 @@
                     <w:sz w:val="14"/>
                     <w:szCs w:val="14"/>
                   </w:rPr>
-                  <w:t xml:space="preserve">Select ▾</w:t>
+                  <w:t xml:space="preserve">5</w:t>
                 </w:r>
               </w:sdtContent>
             </w:sdt>
@@ -12872,7 +12872,7 @@
                     <w:sz w:val="14"/>
                     <w:szCs w:val="14"/>
                   </w:rPr>
-                  <w:t xml:space="preserve">Select ▾</w:t>
+                  <w:t xml:space="preserve">Yes</w:t>
                 </w:r>
               </w:sdtContent>
             </w:sdt>
@@ -12904,7 +12904,7 @@
                     <w:sz w:val="14"/>
                     <w:szCs w:val="14"/>
                   </w:rPr>
-                  <w:t xml:space="preserve">type here</w:t>
+                  <w:t xml:space="preserve">models/skyhydro_flood_uav.xml, simulate.py, environment/, rl/, train_all.py</w:t>
                 </w:r>
               </w:sdtContent>
             </w:sdt>
@@ -12936,7 +12936,7 @@
                     <w:sz w:val="14"/>
                     <w:szCs w:val="14"/>
                   </w:rPr>
-                  <w:t xml:space="preserve">type here</w:t>
+                  <w:t xml:space="preserve">100 % (1 of 1 commits in the folder, team PR #1)</w:t>
                 </w:r>
               </w:sdtContent>
             </w:sdt>
@@ -12974,7 +12974,7 @@
                     <w:sz w:val="14"/>
                     <w:szCs w:val="14"/>
                   </w:rPr>
-                  <w:t xml:space="preserve">Select ▾</w:t>
+                  <w:t xml:space="preserve">76–100 %</w:t>
                 </w:r>
               </w:sdtContent>
             </w:sdt>
@@ -13012,7 +13012,7 @@
                     <w:sz w:val="14"/>
                     <w:szCs w:val="14"/>
                   </w:rPr>
-                  <w:t xml:space="preserve">Select ▾</w:t>
+                  <w:t xml:space="preserve">3–5</w:t>
                 </w:r>
               </w:sdtContent>
             </w:sdt>
@@ -13071,7 +13071,7 @@
                     <w:sz w:val="14"/>
                     <w:szCs w:val="14"/>
                   </w:rPr>
-                  <w:t xml:space="preserve">type here</w:t>
+                  <w:t xml:space="preserve">20</w:t>
                 </w:r>
               </w:sdtContent>
             </w:sdt>
@@ -13110,7 +13110,7 @@
                     <w:sz w:val="14"/>
                     <w:szCs w:val="14"/>
                   </w:rPr>
-                  <w:t xml:space="preserve">Select ▾</w:t>
+                  <w:t xml:space="preserve">4</w:t>
                 </w:r>
               </w:sdtContent>
             </w:sdt>
@@ -13146,7 +13146,7 @@
                     <w:sz w:val="14"/>
                     <w:szCs w:val="14"/>
                   </w:rPr>
-                  <w:t xml:space="preserve">Select ▾</w:t>
+                  <w:t xml:space="preserve">Yes</w:t>
                 </w:r>
               </w:sdtContent>
             </w:sdt>
@@ -13178,7 +13178,7 @@
                     <w:sz w:val="14"/>
                     <w:szCs w:val="14"/>
                   </w:rPr>
-                  <w:t xml:space="preserve">type here</w:t>
+                  <w:t xml:space="preserve">src/flood_relief_drop_sim.py (FSM, vision-guided release)</w:t>
                 </w:r>
               </w:sdtContent>
             </w:sdt>
@@ -13210,7 +13210,7 @@
                     <w:sz w:val="14"/>
                     <w:szCs w:val="14"/>
                   </w:rPr>
-                  <w:t xml:space="preserve">type here</w:t>
+                  <w:t xml:space="preserve">0 % (work merged through the team PR #1)</w:t>
                 </w:r>
               </w:sdtContent>
             </w:sdt>
@@ -13248,7 +13248,7 @@
                     <w:sz w:val="14"/>
                     <w:szCs w:val="14"/>
                   </w:rPr>
-                  <w:t xml:space="preserve">Select ▾</w:t>
+                  <w:t xml:space="preserve">76–100 %</w:t>
                 </w:r>
               </w:sdtContent>
             </w:sdt>
@@ -13286,7 +13286,7 @@
                     <w:sz w:val="14"/>
                     <w:szCs w:val="14"/>
                   </w:rPr>
-                  <w:t xml:space="preserve">Select ▾</w:t>
+                  <w:t xml:space="preserve">1–2</w:t>
                 </w:r>
               </w:sdtContent>
             </w:sdt>
@@ -13345,7 +13345,7 @@
                     <w:sz w:val="14"/>
                     <w:szCs w:val="14"/>
                   </w:rPr>
-                  <w:t xml:space="preserve">type here</w:t>
+                  <w:t xml:space="preserve">20</w:t>
                 </w:r>
               </w:sdtContent>
             </w:sdt>
@@ -13384,7 +13384,7 @@
                     <w:sz w:val="14"/>
                     <w:szCs w:val="14"/>
                   </w:rPr>
-                  <w:t xml:space="preserve">Select ▾</w:t>
+                  <w:t xml:space="preserve">4</w:t>
                 </w:r>
               </w:sdtContent>
             </w:sdt>
@@ -13420,7 +13420,7 @@
                     <w:sz w:val="14"/>
                     <w:szCs w:val="14"/>
                   </w:rPr>
-                  <w:t xml:space="preserve">Select ▾</w:t>
+                  <w:t xml:space="preserve">Yes</w:t>
                 </w:r>
               </w:sdtContent>
             </w:sdt>
@@ -13452,7 +13452,7 @@
                     <w:sz w:val="14"/>
                     <w:szCs w:val="14"/>
                   </w:rPr>
-                  <w:t xml:space="preserve">type here</w:t>
+                  <w:t xml:space="preserve">analytics/analyze_trials.py, analytics/evaluate_rl_pilot.py</w:t>
                 </w:r>
               </w:sdtContent>
             </w:sdt>
@@ -13484,7 +13484,7 @@
                     <w:sz w:val="14"/>
                     <w:szCs w:val="14"/>
                   </w:rPr>
-                  <w:t xml:space="preserve">type here</w:t>
+                  <w:t xml:space="preserve">0 % (work merged through the team PR #1)</w:t>
                 </w:r>
               </w:sdtContent>
             </w:sdt>
@@ -13522,7 +13522,7 @@
                     <w:sz w:val="14"/>
                     <w:szCs w:val="14"/>
                   </w:rPr>
-                  <w:t xml:space="preserve">Select ▾</w:t>
+                  <w:t xml:space="preserve">76–100 %</w:t>
                 </w:r>
               </w:sdtContent>
             </w:sdt>
@@ -13560,7 +13560,7 @@
                     <w:sz w:val="14"/>
                     <w:szCs w:val="14"/>
                   </w:rPr>
-                  <w:t xml:space="preserve">Select ▾</w:t>
+                  <w:t xml:space="preserve">1–2</w:t>
                 </w:r>
               </w:sdtContent>
             </w:sdt>
@@ -13617,7 +13617,7 @@
                     <w:sz w:val="14"/>
                     <w:szCs w:val="14"/>
                   </w:rPr>
-                  <w:t xml:space="preserve">type here</w:t>
+                  <w:t xml:space="preserve">20</w:t>
                 </w:r>
               </w:sdtContent>
             </w:sdt>
@@ -13655,7 +13655,7 @@
                     <w:sz w:val="14"/>
                     <w:szCs w:val="14"/>
                   </w:rPr>
-                  <w:t xml:space="preserve">Select ▾</w:t>
+                  <w:t xml:space="preserve">4</w:t>
                 </w:r>
               </w:sdtContent>
             </w:sdt>
@@ -13690,7 +13690,7 @@
                     <w:sz w:val="14"/>
                     <w:szCs w:val="14"/>
                   </w:rPr>
-                  <w:t xml:space="preserve">Select ▾</w:t>
+                  <w:t xml:space="preserve">Yes</w:t>
                 </w:r>
               </w:sdtContent>
             </w:sdt>
@@ -13721,7 +13721,7 @@
                     <w:sz w:val="14"/>
                     <w:szCs w:val="14"/>
                   </w:rPr>
-                  <w:t xml:space="preserve">type here</w:t>
+                  <w:t xml:space="preserve">analytics/disaster_relief_logistics.py</w:t>
                 </w:r>
               </w:sdtContent>
             </w:sdt>
@@ -13752,7 +13752,7 @@
                     <w:sz w:val="14"/>
                     <w:szCs w:val="14"/>
                   </w:rPr>
-                  <w:t xml:space="preserve">type here</w:t>
+                  <w:t xml:space="preserve">0 % (work merged through the team PR #1)</w:t>
                 </w:r>
               </w:sdtContent>
             </w:sdt>
@@ -13789,7 +13789,7 @@
                     <w:sz w:val="14"/>
                     <w:szCs w:val="14"/>
                   </w:rPr>
-                  <w:t xml:space="preserve">Select ▾</w:t>
+                  <w:t xml:space="preserve">76–100 %</w:t>
                 </w:r>
               </w:sdtContent>
             </w:sdt>
@@ -13826,7 +13826,7 @@
                     <w:sz w:val="14"/>
                     <w:szCs w:val="14"/>
                   </w:rPr>
-                  <w:t xml:space="preserve">Select ▾</w:t>
+                  <w:t xml:space="preserve">1–2</w:t>
                 </w:r>
               </w:sdtContent>
             </w:sdt>
@@ -14002,7 +14002,7 @@
                     <w:sz w:val="14"/>
                     <w:szCs w:val="14"/>
                   </w:rPr>
-                  <w:t xml:space="preserve">Select ▾</w:t>
+                  <w:t xml:space="preserve">Yes</w:t>
                 </w:r>
               </w:sdtContent>
             </w:sdt>
@@ -14034,7 +14034,7 @@
                     <w:sz w:val="14"/>
                     <w:szCs w:val="14"/>
                   </w:rPr>
-                  <w:t xml:space="preserve">type here</w:t>
+                  <w:t xml:space="preserve">Testing every AI claim by running it: the GPU-speed and memory claims only failed on the real lab PC.</w:t>
                 </w:r>
               </w:sdtContent>
             </w:sdt>
@@ -14066,7 +14066,7 @@
                     <w:sz w:val="14"/>
                     <w:szCs w:val="14"/>
                   </w:rPr>
-                  <w:t xml:space="preserve">type here</w:t>
+                  <w:t xml:space="preserve">Give lab-PC access and a sample MuJoCo project in the first week so setup problems show up early.</w:t>
                 </w:r>
               </w:sdtContent>
             </w:sdt>
@@ -14129,7 +14129,7 @@
                     <w:sz w:val="14"/>
                     <w:szCs w:val="14"/>
                   </w:rPr>
-                  <w:t xml:space="preserve">Select ▾</w:t>
+                  <w:t xml:space="preserve">No</w:t>
                 </w:r>
               </w:sdtContent>
             </w:sdt>
@@ -14161,7 +14161,7 @@
                     <w:sz w:val="14"/>
                     <w:szCs w:val="14"/>
                   </w:rPr>
-                  <w:t xml:space="preserve">type here</w:t>
+                  <w:t xml:space="preserve">How a state machine plus cascaded PID makes a drone hover and release a swinging load safely.</w:t>
                 </w:r>
               </w:sdtContent>
             </w:sdt>
@@ -14193,7 +14193,7 @@
                     <w:sz w:val="14"/>
                     <w:szCs w:val="14"/>
                   </w:rPr>
-                  <w:t xml:space="preserve">type here</w:t>
+                  <w:t xml:space="preserve">One lab session on MuJoCo actuators and the viewer before the capstone starts.</w:t>
                 </w:r>
               </w:sdtContent>
             </w:sdt>
@@ -14256,7 +14256,7 @@
                     <w:sz w:val="14"/>
                     <w:szCs w:val="14"/>
                   </w:rPr>
-                  <w:t xml:space="preserve">Select ▾</w:t>
+                  <w:t xml:space="preserve">No</w:t>
                 </w:r>
               </w:sdtContent>
             </w:sdt>
@@ -14288,7 +14288,7 @@
                     <w:sz w:val="14"/>
                     <w:szCs w:val="14"/>
                   </w:rPr>
-                  <w:t xml:space="preserve">type here</w:t>
+                  <w:t xml:space="preserve">Designing paired-seed Monte Carlo trials and reading Welch's t-test and Cohen's d correctly.</w:t>
                 </w:r>
               </w:sdtContent>
             </w:sdt>
@@ -14320,7 +14320,7 @@
                     <w:sz w:val="14"/>
                     <w:szCs w:val="14"/>
                   </w:rPr>
-                  <w:t xml:space="preserve">type here</w:t>
+                  <w:t xml:space="preserve">A worked example of the statistics section earlier in the semester.</w:t>
                 </w:r>
               </w:sdtContent>
             </w:sdt>
@@ -14381,7 +14381,7 @@
                     <w:sz w:val="14"/>
                     <w:szCs w:val="14"/>
                   </w:rPr>
-                  <w:t xml:space="preserve">Select ▾</w:t>
+                  <w:t xml:space="preserve">No</w:t>
                 </w:r>
               </w:sdtContent>
             </w:sdt>
@@ -14412,7 +14412,7 @@
                     <w:sz w:val="14"/>
                     <w:szCs w:val="14"/>
                   </w:rPr>
-                  <w:t xml:space="preserve">type here</w:t>
+                  <w:t xml:space="preserve">Building a dimensionless cost model and showing with a sensitivity graph where the conclusion breaks.</w:t>
                 </w:r>
               </w:sdtContent>
             </w:sdt>
@@ -14443,7 +14443,7 @@
                     <w:sz w:val="14"/>
                     <w:szCs w:val="14"/>
                   </w:rPr>
-                  <w:t xml:space="preserve">type here</w:t>
+                  <w:t xml:space="preserve">More time between the trial data and the business model deadline.</w:t>
                 </w:r>
               </w:sdtContent>
             </w:sdt>
@@ -15026,7 +15026,7 @@
                     <w:sz w:val="15"/>
                     <w:szCs w:val="15"/>
                   </w:rPr>
-                  <w:t xml:space="preserve">Select ▾</w:t>
+                  <w:t xml:space="preserve">Yes</w:t>
                 </w:r>
               </w:sdtContent>
             </w:sdt>
@@ -15062,7 +15062,7 @@
                     <w:sz w:val="15"/>
                     <w:szCs w:val="15"/>
                   </w:rPr>
-                  <w:t xml:space="preserve">Select ▾</w:t>
+                  <w:t xml:space="preserve">Yes</w:t>
                 </w:r>
               </w:sdtContent>
             </w:sdt>
@@ -15098,7 +15098,7 @@
                     <w:sz w:val="15"/>
                     <w:szCs w:val="15"/>
                   </w:rPr>
-                  <w:t xml:space="preserve">Select ▾</w:t>
+                  <w:t xml:space="preserve">Yes</w:t>
                 </w:r>
               </w:sdtContent>
             </w:sdt>
@@ -15112,6 +15112,12 @@
             <w:pPr>
               <w:keepNext/>
             </w:pPr>
+            <w:r>
+              <w:rPr>
+                <w:i/>
+              </w:rPr>
+              <w:t>Manikya Rathore</w:t>
+            </w:r>
           </w:p>
         </w:tc>
         <w:tc>
@@ -15144,7 +15150,7 @@
                     <w:sz w:val="15"/>
                     <w:szCs w:val="15"/>
                   </w:rPr>
-                  <w:t xml:space="preserve">Select ▾</w:t>
+                  <w:t xml:space="preserve">Yes</w:t>
                 </w:r>
               </w:sdtContent>
             </w:sdt>
@@ -15207,7 +15213,7 @@
                     <w:sz w:val="15"/>
                     <w:szCs w:val="15"/>
                   </w:rPr>
-                  <w:t xml:space="preserve">Select ▾</w:t>
+                  <w:t xml:space="preserve">Yes</w:t>
                 </w:r>
               </w:sdtContent>
             </w:sdt>
@@ -15243,7 +15249,7 @@
                     <w:sz w:val="15"/>
                     <w:szCs w:val="15"/>
                   </w:rPr>
-                  <w:t xml:space="preserve">Select ▾</w:t>
+                  <w:t xml:space="preserve">Yes</w:t>
                 </w:r>
               </w:sdtContent>
             </w:sdt>
@@ -15279,7 +15285,7 @@
                     <w:sz w:val="15"/>
                     <w:szCs w:val="15"/>
                   </w:rPr>
-                  <w:t xml:space="preserve">Select ▾</w:t>
+                  <w:t xml:space="preserve">Yes</w:t>
                 </w:r>
               </w:sdtContent>
             </w:sdt>
@@ -15293,6 +15299,12 @@
             <w:pPr>
               <w:keepNext/>
             </w:pPr>
+            <w:r>
+              <w:rPr>
+                <w:i/>
+              </w:rPr>
+              <w:t>Shourya Garg</w:t>
+            </w:r>
           </w:p>
         </w:tc>
         <w:tc>
@@ -15325,7 +15337,7 @@
                     <w:sz w:val="15"/>
                     <w:szCs w:val="15"/>
                   </w:rPr>
-                  <w:t xml:space="preserve">Select ▾</w:t>
+                  <w:t xml:space="preserve">Yes</w:t>
                 </w:r>
               </w:sdtContent>
             </w:sdt>
@@ -15388,7 +15400,7 @@
                     <w:sz w:val="15"/>
                     <w:szCs w:val="15"/>
                   </w:rPr>
-                  <w:t xml:space="preserve">Select ▾</w:t>
+                  <w:t xml:space="preserve">Yes</w:t>
                 </w:r>
               </w:sdtContent>
             </w:sdt>
@@ -15424,7 +15436,7 @@
                     <w:sz w:val="15"/>
                     <w:szCs w:val="15"/>
                   </w:rPr>
-                  <w:t xml:space="preserve">Select ▾</w:t>
+                  <w:t xml:space="preserve">Yes</w:t>
                 </w:r>
               </w:sdtContent>
             </w:sdt>
@@ -15460,7 +15472,7 @@
                     <w:sz w:val="15"/>
                     <w:szCs w:val="15"/>
                   </w:rPr>
-                  <w:t xml:space="preserve">Select ▾</w:t>
+                  <w:t xml:space="preserve">Yes</w:t>
                 </w:r>
               </w:sdtContent>
             </w:sdt>
@@ -15474,6 +15486,12 @@
             <w:pPr>
               <w:keepNext/>
             </w:pPr>
+            <w:r>
+              <w:rPr>
+                <w:i/>
+              </w:rPr>
+              <w:t>Keswani Laksh</w:t>
+            </w:r>
           </w:p>
         </w:tc>
         <w:tc>
@@ -15506,7 +15524,7 @@
                     <w:sz w:val="15"/>
                     <w:szCs w:val="15"/>
                   </w:rPr>
-                  <w:t xml:space="preserve">Select ▾</w:t>
+                  <w:t xml:space="preserve">Yes</w:t>
                 </w:r>
               </w:sdtContent>
             </w:sdt>
@@ -15567,7 +15585,7 @@
                     <w:sz w:val="15"/>
                     <w:szCs w:val="15"/>
                   </w:rPr>
-                  <w:t xml:space="preserve">Select ▾</w:t>
+                  <w:t xml:space="preserve">Yes</w:t>
                 </w:r>
               </w:sdtContent>
             </w:sdt>
@@ -15602,7 +15620,7 @@
                     <w:sz w:val="15"/>
                     <w:szCs w:val="15"/>
                   </w:rPr>
-                  <w:t xml:space="preserve">Select ▾</w:t>
+                  <w:t xml:space="preserve">Yes</w:t>
                 </w:r>
               </w:sdtContent>
             </w:sdt>
@@ -15637,7 +15655,7 @@
                     <w:sz w:val="15"/>
                     <w:szCs w:val="15"/>
                   </w:rPr>
-                  <w:t xml:space="preserve">Select ▾</w:t>
+                  <w:t xml:space="preserve">Yes</w:t>
                 </w:r>
               </w:sdtContent>
             </w:sdt>
@@ -15647,7 +15665,14 @@
           <w:tcPr>
             <w:tcW w:type="dxa" w:w="2211"/>
           </w:tcPr>
-          <w:p/>
+          <w:p>
+            <w:r>
+              <w:rPr>
+                <w:i/>
+              </w:rPr>
+              <w:t>Vora Jash</w:t>
+            </w:r>
+          </w:p>
         </w:tc>
         <w:tc>
           <w:tcPr>
@@ -15678,7 +15703,7 @@
                     <w:sz w:val="15"/>
                     <w:szCs w:val="15"/>
                   </w:rPr>
-                  <w:t xml:space="preserve">Select ▾</w:t>
+                  <w:t xml:space="preserve">Yes</w:t>
                 </w:r>
               </w:sdtContent>
             </w:sdt>

</xml_diff>